<commit_message>
Update English instruction references and vault coverage notes.
Replace deprecated guide wording and document UKR pack discoverability in report and template indexes/checklists.

Co-authored-by: Cursor <cursoragent@cursor.com>
</commit_message>
<xml_diff>
--- a/ReportTemplates/ENG/DOCX/Instructions_for_filling_templates.docx
+++ b/ReportTemplates/ENG/DOCX/Instructions_for_filling_templates.docx
@@ -501,7 +501,7 @@
       </w:pPr>
       <w:r>
         <w:rPr/>
-        <w:t>Government Authorities Guide</w:t>
+        <w:t>Position Data Verification</w:t>
       </w:r>
     </w:p>
     <w:p>
@@ -552,7 +552,7 @@
       </w:pPr>
       <w:r>
         <w:rPr/>
-        <w:t>- If current data differs from the guide file, add a comment in your working document.</w:t>
+        <w:t>- If current data differs from the internal reference data file, add a comment in your working document.</w:t>
       </w:r>
     </w:p>
     <w:p>

</xml_diff>